<commit_message>
Review supervisor Docs 3-5 for accuracy and clear explanations
</commit_message>
<xml_diff>
--- a/40_DOCS/Supervisor_Drafts/Doc_3_Player_Pillar_II.docx
+++ b/40_DOCS/Supervisor_Drafts/Doc_3_Player_Pillar_II.docx
@@ -27,7 +27,7 @@
         <w:jc w:val="left"/>
       </w:pPr>
       <w:r>
-        <w:t>This is a market-based price for production. It does not measure a player's total economic contribution to his club or establish that league-wide salaries equal the true value of winning.</w:t>
+        <w:t>The result is a market-based estimate of surplus: what the projected production would command under the fitted salary equation, less the cost of obtaining it. A player's broader contribution to club revenue or the economic value of winning is outside this calculation.</w:t>
       </w:r>
     </w:p>
     <w:p>
@@ -55,25 +55,25 @@
         <w:jc w:val="left"/>
       </w:pPr>
       <w:r>
-        <w:t>The fit accounts for the salary floor. In 529 observations, pay is at the minimum, so an ordinary straight-line regression would treat a constrained outcome as though pay could have fallen further. The censored regression, also called a Tobit model, allows the underlying fitted price to fall below that boundary while observed pay stops at the minimum.</w:t>
-      </w:r>
-    </w:p>
-    <w:p>
-      <w:pPr>
-        <w:spacing w:after="200"/>
-        <w:jc w:val="left"/>
-      </w:pPr>
-      <w:r>
-        <w:t>An above-minimum contract tells the fit its observed price. A minimum contract contributes the probability that the underlying price would lie at or below that minimum. This does not mean minimum deals were unnegotiated. It means their observed salary alone cannot distinguish a player who would command that exact price from one whose unconstrained price would be lower. The method assumes a linear underlying price and normally distributed residuals around it; accounting for the floor does not remove those assumptions.</w:t>
-      </w:r>
-    </w:p>
-    <w:p>
-      <w:pPr>
-        <w:spacing w:after="200"/>
-        <w:jc w:val="left"/>
-      </w:pPr>
-      <w:r>
-        <w:t>The sample begins in 2018 because earlier contract coverage is thin and selected. The recorded export has 63, 223, and 452 contracts for starts in 2015, 2016, and 2017, compared with roughly 700 a year afterward. Including those earlier years would let whichever contracts survived in the export influence the estimated market rate. The coverage decision reduces that problem at the cost of a shorter estimation window.</w:t>
+        <w:t>The fit accounts for the league-minimum salary. In 529 observations, pay is at that minimum. An ordinary regression treats those salaries like unconstrained observations, even though the rules prevent a lower salary. The censored regression, also called a Tobit model, allows a player's underlying price to fall below the minimum while his observed pay stops at that boundary.</w:t>
+      </w:r>
+    </w:p>
+    <w:p>
+      <w:pPr>
+        <w:spacing w:after="200"/>
+        <w:jc w:val="left"/>
+      </w:pPr>
+      <w:r>
+        <w:t>For an above-minimum contract, the model compares the observed salary with the price predicted from production and position. For a minimum contract, it estimates the probability that the underlying price is at or below the minimum. This accounts for the salary constraint while retaining two assumptions: the underlying price follows a straight line in production, and unexplained differences around it follow a normal distribution. A minimum contract can still have been negotiated; its observed salary simply conceals how far below the floor an unconstrained price might have been.</w:t>
+      </w:r>
+    </w:p>
+    <w:p>
+      <w:pPr>
+        <w:spacing w:after="200"/>
+        <w:jc w:val="left"/>
+      </w:pPr>
+      <w:r>
+        <w:t>The sample begins in 2018 because earlier contract coverage is thin. The export contains 63, 223, and 452 contracts starting in 2015, 2016, and 2017, compared with roughly 700 a year afterward. Those earlier observations may not represent the contracts signed in those years, so the estimation uses the shorter window with broader coverage.</w:t>
       </w:r>
     </w:p>
     <w:p>
@@ -91,43 +91,61 @@
         <w:jc w:val="left"/>
       </w:pPr>
       <w:r>
-        <w:t>For example, a two-win forward prices at about $5.32 million before any forecast-uncertainty adjustment: the $1.27 million intercept plus two wins at about $2.03 million each. A two-win defenceman prices at about $5.87 million. Subtracting a $4 million cap hit leaves about $1.32 million or $1.87 million in that season, before future survival and discounting. These examples illustrate the equation; they are not estimates for named contracts.</w:t>
-      </w:r>
-    </w:p>
-    <w:p>
-      <w:pPr>
-        <w:spacing w:after="200"/>
-        <w:jc w:val="left"/>
-      </w:pPr>
-      <w:r>
-        <w:t>The shared intercept assigns the same fitted price at zero measured wins. The defence term changes the slope. Its size alone says nothing about how precisely it is estimated; uncertainty depends on the data and the fit. Likewise, the residual scale reported by the censored model is not an ordinary R-squared and should not be read as the percentage of salary variation explained.</w:t>
-      </w:r>
-    </w:p>
-    <w:p>
-      <w:pPr>
-        <w:spacing w:after="200"/>
-        <w:jc w:val="left"/>
-      </w:pPr>
-      <w:r>
-        <w:t>The model uses one skater price equation for restricted and unrestricted free agents. An earlier apparent separation did not survive correction of the sample. It also has no contract-length term. The completed length-term test found no value-side contribution in its tested specification; optional robustness runs using raw Game Value remain unrun. That result does not establish that clubs place no value on cost certainty or flexibility.</w:t>
-      </w:r>
-    </w:p>
-    <w:p>
-      <w:pPr>
-        <w:spacing w:after="200"/>
-        <w:jc w:val="left"/>
-      </w:pPr>
-      <w:r>
-        <w:t>The earlier corrected RFA/UFA comparison gave F = 0.12 and p = 0.887 after goaltenders were removed from the skater sample. That result motivated pooling the skater market; it is not proof that every RFA and UFA faces identical bargaining conditions. The star-RFA interaction examined later is a separate exploratory question and is not included in the current price equation.</w:t>
-      </w:r>
-    </w:p>
-    <w:p>
-      <w:pPr>
-        <w:spacing w:after="200"/>
-        <w:jc w:val="left"/>
-      </w:pPr>
-      <w:r>
-        <w:t>The current equation also pools cap regimes. A common rate makes the historical valuations comparable under one market benchmark, but assumes that pricing relationships are stable enough to apply across the window. Separate era fits can test that assumption. A common cap-share scale does not guarantee stable coefficients, and surplus ratios do not remove any resulting error.</w:t>
+        <w:t>For an illustrative two-win forward at a $95.5 million cap, the equation gives about $5.32 million: a $1.265 million intercept plus two wins at about $2.028 million each. A two-win defenceman prices at about $5.87 million. Subtracting a $4 million cap hit leaves about $1.32 million or $1.87 million in surplus for that season. The forecast-uncertainty adjustment, survival probabilities, and discounting enter later.</w:t>
+      </w:r>
+    </w:p>
+    <w:p>
+      <w:pPr>
+        <w:spacing w:after="200"/>
+        <w:jc w:val="left"/>
+      </w:pPr>
+      <w:r>
+        <w:t>The common intercept gives forwards and defencemen the same fitted price at zero WAR. The positional difference grows with production because it enters through the price per win. These are estimated coefficients, with uncertainty around them. The censored model also estimates the spread of unexplained salary differences; that spread is not an R-squared or a percentage of salary variation explained. A nonlinear alternative allowed the price per win to change with production level. It fitted observed salaries better but predicted held-out salaries less accurately, so the straight-line specification was retained.</w:t>
+      </w:r>
+    </w:p>
+    <w:p>
+      <w:pPr>
+        <w:spacing w:after="200"/>
+        <w:jc w:val="left"/>
+      </w:pPr>
+      <w:r>
+        <w:t>The equation uses one skater market for restricted and unrestricted free agents and excludes contract length. These choices came from separate tests.</w:t>
+      </w:r>
+    </w:p>
+    <w:p>
+      <w:pPr>
+        <w:spacing w:after="200"/>
+        <w:jc w:val="left"/>
+      </w:pPr>
+      <w:r>
+        <w:t>The contract-length test asked whether longer contracts predicted more subsequent production after accounting for the player's trailing baseline. Its main comparison used 1,781 contracts and average annual adjusted Game Value over three seasons. Each additional year of contract length was associated with -0.0135 wins per season, with a 95% interval from -0.0360 to +0.0089. The interval includes zero, and the model applied no positive value-side adjustment for length.</w:t>
+      </w:r>
+    </w:p>
+    <w:p>
+      <w:pPr>
+        <w:spacing w:after="200"/>
+        <w:jc w:val="left"/>
+      </w:pPr>
+      <w:r>
+        <w:t>The subgroup results were not uniformly zero. For forwards, the estimated association was +0.0273 wins per season per additional year of term, with a 95% interval from +0.0028 to +0.0518. This small subgroup result has not been adopted in the price equation. Two- and four-season checks also found no detectable pooled association; optional checks using raw Game Value remain unrun. The tests concern subsequent production, rather than a direct estimate of what clubs pay for cost certainty or flexibility.</w:t>
+      </w:r>
+    </w:p>
+    <w:p>
+      <w:pPr>
+        <w:spacing w:after="200"/>
+        <w:jc w:val="left"/>
+      </w:pPr>
+      <w:r>
+        <w:t>The RFA/UFA comparison asked whether separate skater price equations were needed. After goalies were removed, the test gave F = 0.12 and p = 0.887, providing little evidence for the split in that specification. The skater markets were therefore pooled. A later exploratory test of star RFAs asks a narrower question about a particular group and is not part of the current equation.</w:t>
+      </w:r>
+    </w:p>
+    <w:p>
+      <w:pPr>
+        <w:spacing w:after="200"/>
+        <w:jc w:val="left"/>
+      </w:pPr>
+      <w:r>
+        <w:t>The equation also uses common coefficients across cap regimes. Expressing salaries as cap shares adjusts for the size of the cap, while leaving the relationship between production and pay fixed across the sample. Comparing coefficients across eras would test that additional assumption. A common scale alone cannot establish stable prices.</w:t>
       </w:r>
     </w:p>
     <w:p>
@@ -164,16 +182,16 @@
         <w:jc w:val="left"/>
       </w:pPr>
       <w:r>
-        <w:t>The spread comes from recorded forecast errors at one-, two-, and three-year horizons. Beyond year three, the model holds the three-year spread fixed. That is a practical assumption, not evidence that longer forecasts stop becoming less certain. The symmetric distribution is also imperfect for players whose central projection has already been moved up to replacement level.</w:t>
-      </w:r>
-    </w:p>
-    <w:p>
-      <w:pPr>
-        <w:spacing w:after="200"/>
-        <w:jc w:val="left"/>
-      </w:pPr>
-      <w:r>
-        <w:t>The input mean absolute errors are 0.522, 0.735, and 0.803 wins. Under the assumed normal distribution, the code multiplies these by about 1.253 to obtain standard deviations of roughly 0.65, 0.92, and 1.01 wins. It converts that production spread into a price spread using the position's slope. The correction concerns the average price after applying the floor; it is not a separate premium for a club's aversion to risk.</w:t>
+        <w:t>The production spread comes from forecast errors one, two, and three years ahead. For longer forecasts, the code reuses the three-year spread because no longer-horizon estimate has been supplied. This choice can understate uncertainty on long contracts. The symmetric distribution also needs care for players whose central projection has already been moved to replacement level: the same spread may not describe their upside and downside well.</w:t>
+      </w:r>
+    </w:p>
+    <w:p>
+      <w:pPr>
+        <w:spacing w:after="200"/>
+        <w:jc w:val="left"/>
+      </w:pPr>
+      <w:r>
+        <w:t>The one-, two-, and three-year mean absolute errors are 0.522, 0.735, and 0.803 wins, measured in a backcast of positive-baseline players. Mean absolute error is the average size of a forecast miss. To use these errors in a normal distribution, the code multiplies them by about 1.253, giving standard deviations of roughly 0.65, 0.92, and 1.01 wins. It then multiplies by the position's dollar price per win. The resulting spread lets the code average over possible prices after applying the minimum. It adds no separate payment for a club's aversion to risk.</w:t>
       </w:r>
     </w:p>
     <w:p>
@@ -192,25 +210,34 @@
         <w:jc w:val="left"/>
       </w:pPr>
       <w:r>
-        <w:t>An unrestricted-free-agent expiry has zero terminal value: the current contract gives the club no further control to price. For an RFA expiry, the model projects production through the remaining control years and compares its price with a sequence of qualifying offers.</w:t>
-      </w:r>
-    </w:p>
-    <w:p>
-      <w:pPr>
-        <w:spacing w:after="200"/>
-        <w:jc w:val="left"/>
-      </w:pPr>
-      <w:r>
-        <w:t>Qualifying offers are a cost convention here. They are not predictions of negotiated salaries. Arbitration, longer agreements, and other outcomes can produce different costs, so the terminal value estimates control under a simplified renewal path.</w:t>
-      </w:r>
-    </w:p>
-    <w:p>
-      <w:pPr>
-        <w:spacing w:after="200"/>
-        <w:jc w:val="left"/>
-      </w:pPr>
-      <w:r>
-        <w:t>This distinction is central to the interpretation. A club may retain negotiating rights without obtaining the player for the qualifying-offer amount. If the eventual negotiated cost exceeds the modeled offer, terminal surplus will be lower than this calculation suggests. The current model does not estimate that negotiation separately, nor does it count the value of a generic open roster spot after the player leaves.</w:t>
+        <w:t>Terminal value is the surplus from team control after the signed contract expires. An unrestricted-free-agent expiry receives zero because that contract gives the club no further control. For an RFA expiry, the model projects production through the remaining control years and subtracts a sequence of modeled qualifying offers.</w:t>
+      </w:r>
+    </w:p>
+    <w:p>
+      <w:pPr>
+        <w:spacing w:after="200"/>
+        <w:jc w:val="left"/>
+      </w:pPr>
+      <w:r>
+        <w:t>The calculation treats qualifying offers as the cost of keeping the player on successive one-year agreements. Actual renewals can involve arbitration or a negotiated contract at a different salary and term. Terminal value therefore depends on a simplified renewal path.</w:t>
+      </w:r>
+    </w:p>
+    <w:p>
+      <w:pPr>
+        <w:spacing w:after="200"/>
+        <w:jc w:val="left"/>
+      </w:pPr>
+      <w:r>
+        <w:t>If the negotiated salary exceeds the modeled qualifying offer, actual control-year surplus will be lower. The model does not separately forecast the negotiation or assign value to a roster spot opened by a departure.</w:t>
+      </w:r>
+    </w:p>
+    <w:p>
+      <w:pPr>
+        <w:spacing w:after="200"/>
+        <w:jc w:val="left"/>
+      </w:pPr>
+      <w:r>
+        <w:t>A check compared the first modeled offer with the next observed contract for 1,439 RFA-expiring deals. The next cap hit was at least as large as the offer in 48.3% of cases. The median difference was about -$0.01 million, while the mean was +$0.69 million. The near-zero median supports the approximation for the middle observation, but the positive mean shows that some renewals cost substantially more. This check covers observed next deals, and compares the modeled offer with their cap hit rather than reconstructing each negotiation.</w:t>
       </w:r>
     </w:p>
     <w:p>
@@ -228,7 +255,7 @@
         <w:jc w:val="left"/>
       </w:pPr>
       <w:r>
-        <w:t>The starting salary is the contract's final-year base salary when available. Otherwise, the code tries another recorded salary from the contract and then its average annual value. These substitutes can miss the salary shape that matters for a qualifying offer. Later control years roll forward from the preceding modeled offer.</w:t>
+        <w:t>The offer starts from the expiring contract's final-year base salary. If that is missing, the code uses the highest recorded base salary elsewhere on the same contract, then average annual value if no base salary is available. In the 1,439-deal check, 355 cases used substitutes. A substitute can miss the final-year salary that determines the offer. Subsequent modeled offers roll forward from the preceding offer.</w:t>
       </w:r>
     </w:p>
     <w:p>
@@ -264,34 +291,34 @@
         <w:jc w:val="left"/>
       </w:pPr>
       <w:r>
-        <w:t>The model stops adding control-year surplus at the first year in which projected value falls below the offer. It does not assume that the club keeps paying through a loss to reach a later rebound. It also weights the remaining years by observed qualification rates for players in the relevant quality groups. This reduces the value of control that clubs often choose not to exercise.</w:t>
-      </w:r>
-    </w:p>
-    <w:p>
-      <w:pPr>
-        <w:spacing w:after="200"/>
-        <w:jc w:val="left"/>
-      </w:pPr>
-      <w:r>
-        <w:t>The stopping rule and the probability weight answer different questions. The first asks whether renewal would be worthwhile at the model's predicted value and offer. The second allows for clubs declining to renew even when that calculation is positive. Without the second step, the positive intercept in the price equation makes many low-production control years look worth keeping when clubs often let comparable players go.</w:t>
-      </w:r>
-    </w:p>
-    <w:p>
-      <w:pPr>
-        <w:spacing w:after="200"/>
-        <w:jc w:val="left"/>
-      </w:pPr>
-      <w:r>
-        <w:t>In the recorded corrected calibration, qualification rates are 100.0% for stars (22 decisions), 93.2% for regulars (190), 79.3% for fringe players (595), and 67.3% for below-replacement players (1,463). The small star sample deserves particular care: the implemented 100% rate reflects no observed non-qualifications in that group, not certainty that every future star is qualified. These rates are re-estimated from the expiry records when the terminal-value script runs.</w:t>
-      </w:r>
-    </w:p>
-    <w:p>
-      <w:pPr>
-        <w:spacing w:after="200"/>
-        <w:jc w:val="left"/>
-      </w:pPr>
-      <w:r>
-        <w:t>The calibration includes players with no usable recent production, assigning them to the bottom quality group instead of dropping them. Removing them would select out many likely walk-aways. Including those decisions raises the recorded overall walk-away rate from 21.3% in 1,231 decisions to 27.0% in 2,270. That correction matters because the qualification gate is being asked to cover departure as well as a club's renewal choice.</w:t>
+        <w:t>The model stops counting control-year surplus when projected value first falls below the offer. Once it has assumed the club walks away, a later rebound adds no further control value. While renewal remains worthwhile, each year is also weighted by the observed qualification rate for the player's projected quality group.</w:t>
+      </w:r>
+    </w:p>
+    <w:p>
+      <w:pPr>
+        <w:spacing w:after="200"/>
+        <w:jc w:val="left"/>
+      </w:pPr>
+      <w:r>
+        <w:t>These steps address two different reasons that control may end. The stopping rule handles a renewal that is unattractive under the model's own value and cost estimates. The qualification rate captures how often clubs renew players of that quality in the data. Without it, the price equation's positive value at zero WAR makes many marginal players look worth keeping even though clubs frequently let them go.</w:t>
+      </w:r>
+    </w:p>
+    <w:p>
+      <w:pPr>
+        <w:spacing w:after="200"/>
+        <w:jc w:val="left"/>
+      </w:pPr>
+      <w:r>
+        <w:t>The qualification rates are 100.0% for stars (22 decisions), 93.2% for regular players (190), 79.3% for fringe players (595), and 67.3% for below-replacement players (1,463). The 100% star rate comes from all 22 observed decisions ending in qualification; applying it to future stars treats that small sample's rate as certain. The script re-estimates the rates from expiry records when it runs.</w:t>
+      </w:r>
+    </w:p>
+    <w:p>
+      <w:pPr>
+        <w:spacing w:after="200"/>
+        <w:jc w:val="left"/>
+      </w:pPr>
+      <w:r>
+        <w:t>The calibration assigns players with no usable recent production to the bottom quality group. Excluding them would remove many likely walk-aways from the sample. Including them expands the sample from 1,231 to 2,270 decisions and raises the observed walk-away rate from 21.3% to 27.0%. This matters because the qualification probability covers both departure from the NHL and the club's renewal decision.</w:t>
       </w:r>
     </w:p>
     <w:p>
@@ -309,7 +336,7 @@
         <w:jc w:val="left"/>
       </w:pPr>
       <w:r>
-        <w:t>Those rates come from observed contract-expiry decisions, with unqualified players included. They are separate from the exit probabilities applied during an existing contract. The code does not apply both gates to the control years. Terminal-year prices use the direct salary floor; they do not receive the forecast-uncertainty correction used in projected skater contract years.</w:t>
+        <w:t>Control years use the qualification probabilities in place of the contract-year exit model. The qualification chain starts at one before the first control year and is not multiplied by the survival probability accumulated during the signed contract. This prevents applying both sets of annual probabilities to the control years, but leaves the treatment of departure before expiry as a limitation to check. Terminal-year prices also use a direct salary floor, without the forecast-uncertainty correction applied to projected skater contract years.</w:t>
       </w:r>
     </w:p>
     <w:p>
@@ -337,7 +364,16 @@
         <w:jc w:val="left"/>
       </w:pPr>
       <w:r>
-        <w:t>For contract year k, measured from the valuation season, the contribution is (S_k times V_k minus C_k) divided by 1.03 raised to k. V_k is the projected market value of production, C_k is the contract's cap cost, and S_k is the probability of still producing NHL value in that year. The contract NPV adds those annual contributions to the separately gated control-year surplus, discounted by its distance from the same valuation date. In the current season k is zero, so there is no time discount.</w:t>
+        <w:t>Each contract year contributes expected production value less the full cap cost, discounted to the valuation date. Written as a formula, this is (S_k times V_k minus C_k) divided by 1.03 raised to k. Here, k is the number of years after valuation, V_k is the projected dollar value of production, C_k is the cap cost, and S_k is the probability of continued NHL participation.</w:t>
+      </w:r>
+    </w:p>
+    <w:p>
+      <w:pPr>
+        <w:spacing w:after="200"/>
+        <w:jc w:val="left"/>
+      </w:pPr>
+      <w:r>
+        <w:t>The model sums those annual amounts and adds control-year surplus, using the separate qualification probabilities and the same valuation date for discounting. In the valuation season, k is zero and survival is one, so neither adjustment reduces that season's value.</w:t>
       </w:r>
     </w:p>
     <w:p>
@@ -373,25 +409,25 @@
         <w:jc w:val="left"/>
       </w:pPr>
       <w:r>
-        <w:t>With unchanged production and price coefficients, gross value stays constant as a share of the projected cap. A fixed nominal cap hit becomes a smaller share over time. Growing value and discounting it at the same rate therefore cancel for that constant-share value stream, while the fixed cost gets cheaper in current-cap terms. The cancellation is specific to those assumptions; changing age, survival, salary costs, or the future-pick timing treatment changes the result.</w:t>
-      </w:r>
-    </w:p>
-    <w:p>
-      <w:pPr>
-        <w:spacing w:after="200"/>
-        <w:jc w:val="left"/>
-      </w:pPr>
-      <w:r>
-        <w:t>The 3% path is a planning assumption. Leaving managerial impatience out keeps the benchmark separate from the behavior the trade study might seek to detect. It does not prove that any observed preference for current assets is excessive: competitive position, uncertainty, and information can also justify paying more for near-term output.</w:t>
-      </w:r>
-    </w:p>
-    <w:p>
-      <w:pPr>
-        <w:spacing w:after="200"/>
-        <w:jc w:val="left"/>
-      </w:pPr>
-      <w:r>
-        <w:t>A contract with negative surplus costs more than this model's expected market price for its production. That need not mean the signing was a mistake. The estimate omits team fit, private information, and the value of avoiding a future negotiation. It also does not price the flexibility lost by committing cap space for many years; charging for that lost flexibility would reduce long-contract value further.</w:t>
+        <w:t>With production and price coefficients held constant, gross value stays at a constant share of the projected cap. Its 3% annual dollar growth is canceled by the 3% discount. A fixed dollar cap hit, however, becomes cheaper in current-cap terms. Changes in projected production or survival still change expected value, and growing costs do not receive the same benefit as fixed costs.</w:t>
+      </w:r>
+    </w:p>
+    <w:p>
+      <w:pPr>
+        <w:spacing w:after="200"/>
+        <w:jc w:val="left"/>
+      </w:pPr>
+      <w:r>
+        <w:t>The 3% path is a planning assumption. The model applies no additional discount for managerial impatience because the trade study may later investigate that behavior. Competitive position, uncertainty, and private information can also explain a club paying more for near-term output, so a preference for current assets would require interpretation.</w:t>
+      </w:r>
+    </w:p>
+    <w:p>
+      <w:pPr>
+        <w:spacing w:after="200"/>
+        <w:jc w:val="left"/>
+      </w:pPr>
+      <w:r>
+        <w:t>A negative surplus means the contract costs more than the fitted market price of its expected production. Team fit, private information, and avoiding a future negotiation may explain why a club still accepts it. The model also omits the cost of losing cap flexibility through a long commitment; adding that cost would lower long-contract value further.</w:t>
       </w:r>
     </w:p>
     <w:p>
@@ -437,16 +473,16 @@
         <w:jc w:val="left"/>
       </w:pPr>
       <w:r>
-        <w:t>For a goalie whose trailing baseline is 4.0 wins, the blend is approximately 0.35 times 4.0 plus 0.65 times 2.19, or 2.82 wins. The larger pull toward the mean reflects the weaker year-to-year signal in goalie results. The recorded player-split validation retained the 65% weight on the mean after shortened-season adjustment. It does not imply that goalies never age; the flat path is the model's chosen extension in the absence of a fitted goalie aging curve.</w:t>
-      </w:r>
-    </w:p>
-    <w:p>
-      <w:pPr>
-        <w:spacing w:after="200"/>
-        <w:jc w:val="left"/>
-      </w:pPr>
-      <w:r>
-        <w:t>Goalie exit probabilities are estimated separately, on the goalie production scale. Carrying a goalie's own historical baseline into future contract years preserves his estimated level; replacing that baseline with the league mean merely because a future performance row is absent would erase the distinction between a strong and weak goalie. Neither carry-forward nor shrinkage supplies evidence for a goalie with no history at all.</w:t>
+        <w:t>For a goalie with a trailing baseline of 4.0 wins, the blend is approximately 0.35 times 4.0 plus 0.65 times 2.19, or 2.82 wins. Player-split validation retained the 65% weight on the league mean after adjusting shortened seasons. That test supports the blend. Holding it flat through future years is a separate modeling choice made without a fitted goalie aging curve.</w:t>
+      </w:r>
+    </w:p>
+    <w:p>
+      <w:pPr>
+        <w:spacing w:after="200"/>
+        <w:jc w:val="left"/>
+      </w:pPr>
+      <w:r>
+        <w:t>Goalie exit probabilities are estimated separately on the goalie production scale. Future contract years retain the goalie's own baseline even when there is no future performance row. This preserves the difference between strong and weak goalies in forecasts. A goalie with no usable history remains unpriced.</w:t>
       </w:r>
     </w:p>
     <w:p>
@@ -464,7 +500,7 @@
         <w:jc w:val="left"/>
       </w:pPr>
       <w:r>
-        <w:t>The September 9 rebuild produced 2,981 contract estimates: 2,591 skaters and 390 goalies. The historical panel contains 6,939 valuation rows. Those counts describe the priced sample, not complete coverage of all NHL contracts.</w:t>
+        <w:t>The September 9 rebuild priced 2,981 contracts: 2,591 skaters and 390 goalies. The historical panel contains 6,939 valuation rows because a contract can be valued from more than one season. These are different counts, and neither represents complete coverage of all NHL contracts.</w:t>
       </w:r>
     </w:p>
     <w:sectPr>

</xml_diff>